<commit_message>
trial with commit message
</commit_message>
<xml_diff>
--- a/trial text files.docx
+++ b/trial text files.docx
@@ -10,6 +10,23 @@
         <w:t>this is the first sentence</w:t>
       </w:r>
     </w:p>
+    <w:p>
+      <w:r>
+        <w:t xml:space="preserve">This is the updated sentence, second sentence </w:t>
+      </w:r>
+    </w:p>
+    <w:p>
+      <w:r>
+        <w:t>This is thir</w:t>
+      </w:r>
+      <w:r>
+        <w:t>d</w:t>
+      </w:r>
+      <w:r>
+        <w:t xml:space="preserve"> sentence</w:t>
+      </w:r>
+    </w:p>
+    <w:p/>
     <w:p/>
     <w:sectPr>
       <w:pgSz w:w="11906" w:h="16838"/>

</xml_diff>